<commit_message>
removed extra check in try catch bracket
</commit_message>
<xml_diff>
--- a/Documentation/Abdullahi Hafza - Design Document First Version.docx
+++ b/Documentation/Abdullahi Hafza - Design Document First Version.docx
@@ -1140,19 +1140,7 @@
         <w:t>Presentation Layer (Client)</w:t>
       </w:r>
       <w:r>
-        <w:t>: A Flutter</w:t>
-      </w:r>
-      <w:r>
-        <w:t xml:space="preserve"> based</w:t>
-      </w:r>
-      <w:r>
-        <w:t xml:space="preserve"> application handling</w:t>
-      </w:r>
-      <w:r>
-        <w:t xml:space="preserve"> the</w:t>
-      </w:r>
-      <w:r>
-        <w:t xml:space="preserve"> user interaction, audio recording, and visual feedback display.</w:t>
+        <w:t>: A Flutter based application handling the user interaction, audio recording, and visual feedback display.</w:t>
       </w:r>
     </w:p>
     <w:p>
@@ -1306,20 +1294,13 @@
     <w:p/>
     <w:p>
       <w:r>
-        <w:t xml:space="preserve">This layer performs all </w:t>
-      </w:r>
-      <w:r>
-        <w:t>d</w:t>
-      </w:r>
-      <w:r>
-        <w:t>igital Signal Processing tasks that would be too heavy for mobile browsers</w:t>
+        <w:t>This layer performs all digital Signal Processing tasks that would be too heavy for mobile browsers</w:t>
       </w:r>
       <w:r>
         <w:t xml:space="preserve"> on Render.</w:t>
       </w:r>
     </w:p>
     <w:p>
-      <w:proofErr w:type="gramStart"/>
       <w:r>
         <w:rPr>
           <w:b/>
@@ -1332,15 +1313,7 @@
           <w:b/>
           <w:bCs/>
         </w:rPr>
-        <w:t>[</w:t>
-      </w:r>
-      <w:proofErr w:type="gramEnd"/>
-      <w:r>
-        <w:rPr>
-          <w:b/>
-          <w:bCs/>
-        </w:rPr>
-        <w:t>1]</w:t>
+        <w:t>[1]</w:t>
       </w:r>
       <w:r>
         <w:t xml:space="preserve"> is a modern cloud hosting platform that lets you deploy web apps, APIs, databases, and background workers </w:t>
@@ -1397,9 +1370,14 @@
       </w:r>
     </w:p>
     <w:p>
+      <w:proofErr w:type="spellStart"/>
       <w:r>
         <w:lastRenderedPageBreak/>
-        <w:t>Parselmouth (</w:t>
+        <w:t>Parselmouth</w:t>
+      </w:r>
+      <w:proofErr w:type="spellEnd"/>
+      <w:r>
+        <w:t xml:space="preserve"> (</w:t>
       </w:r>
       <w:proofErr w:type="spellStart"/>
       <w:r>
@@ -1505,450 +1483,72 @@
           <w:b/>
           <w:bCs/>
         </w:rPr>
-        <w:t>cannot run Parselmouth</w:t>
-      </w:r>
+        <w:t xml:space="preserve">cannot run </w:t>
+      </w:r>
+      <w:proofErr w:type="spellStart"/>
+      <w:r>
+        <w:rPr>
+          <w:b/>
+          <w:bCs/>
+        </w:rPr>
+        <w:t>Parselmouth</w:t>
+      </w:r>
+      <w:proofErr w:type="spellEnd"/>
       <w:r>
         <w:t xml:space="preserve"> because they don’t support such heavy DSP libraries.</w:t>
       </w:r>
       <w:r>
-        <w:t xml:space="preserve"> </w:t>
-      </w:r>
-      <w:proofErr w:type="gramStart"/>
-      <w:r>
-        <w:t>So</w:t>
-      </w:r>
-      <w:proofErr w:type="gramEnd"/>
-      <w:r>
-        <w:t xml:space="preserve"> Render was the best option</w:t>
+        <w:t xml:space="preserve"> So Render was the best option</w:t>
       </w:r>
     </w:p>
     <w:p/>
+    <w:p>
+      <w:pPr>
+        <w:pStyle w:val="Heading3"/>
+      </w:pPr>
+      <w:r>
+        <w:t>Render Workflow</w:t>
+      </w:r>
+    </w:p>
     <w:p/>
     <w:p>
       <w:pPr>
-        <w:pStyle w:val="Heading2"/>
-      </w:pPr>
-      <w:bookmarkStart w:id="3" w:name="_Toc215499730"/>
-      <w:r>
-        <w:t>Data Layer (Firebase + Local JSON Assets)</w:t>
-      </w:r>
-      <w:bookmarkEnd w:id="3"/>
-    </w:p>
-    <w:p/>
-    <w:p>
-      <w:r>
-        <w:t>The project integrates two data sources:</w:t>
-      </w:r>
-    </w:p>
-    <w:p>
-      <w:pPr>
+        <w:pStyle w:val="ListParagraph"/>
         <w:numPr>
           <w:ilvl w:val="0"/>
-          <w:numId w:val="13"/>
+          <w:numId w:val="16"/>
         </w:numPr>
       </w:pPr>
       <w:r>
-        <w:rPr>
-          <w:b/>
-          <w:bCs/>
-        </w:rPr>
-        <w:t>Firebase Authentication</w:t>
-      </w:r>
-      <w:r>
-        <w:t>: Manages secure user sessions.</w:t>
-      </w:r>
-    </w:p>
-    <w:p>
-      <w:pPr>
+        <w:t>Render receives a request from the website to analyse audio input from user.</w:t>
+      </w:r>
+    </w:p>
+    <w:p>
+      <w:pPr>
+        <w:pStyle w:val="ListParagraph"/>
         <w:numPr>
           <w:ilvl w:val="0"/>
-          <w:numId w:val="13"/>
+          <w:numId w:val="16"/>
         </w:numPr>
       </w:pPr>
       <w:r>
-        <w:rPr>
-          <w:b/>
-          <w:bCs/>
-        </w:rPr>
-        <w:t>Local JSON Decks</w:t>
-      </w:r>
-      <w:r>
-        <w:t>: Pre-processed Anki flashcards containing vocabulary, readings, example sentences, and audio assets.</w:t>
-      </w:r>
-    </w:p>
-    <w:p/>
-    <w:p>
-      <w:pPr>
-        <w:pStyle w:val="Heading1"/>
-      </w:pPr>
-      <w:bookmarkStart w:id="4" w:name="_Toc215499731"/>
-      <w:r>
-        <w:t>anki connect api</w:t>
-      </w:r>
-      <w:bookmarkEnd w:id="4"/>
-    </w:p>
-    <w:p/>
-    <w:p>
-      <w:r>
-        <w:t>T</w:t>
-      </w:r>
-      <w:r>
-        <w:t xml:space="preserve">o integrate vocabulary from </w:t>
-      </w:r>
-      <w:proofErr w:type="gramStart"/>
-      <w:r>
-        <w:t xml:space="preserve">the </w:t>
-      </w:r>
-      <w:r>
-        <w:t>a</w:t>
-      </w:r>
-      <w:proofErr w:type="gramEnd"/>
-      <w:r>
-        <w:t xml:space="preserve"> </w:t>
-      </w:r>
-      <w:r>
-        <w:t xml:space="preserve">deck into </w:t>
-      </w:r>
-      <w:r>
-        <w:t>flutter</w:t>
-      </w:r>
-      <w:r>
-        <w:t xml:space="preserve">, the project uses </w:t>
+        <w:t xml:space="preserve">Using python, the audio is first converted from </w:t>
       </w:r>
       <w:proofErr w:type="spellStart"/>
-      <w:proofErr w:type="gramStart"/>
-      <w:r>
-        <w:rPr>
-          <w:b/>
-          <w:bCs/>
-        </w:rPr>
-        <w:t>AnkiConnect</w:t>
+      <w:r>
+        <w:t>WebM</w:t>
       </w:r>
       <w:proofErr w:type="spellEnd"/>
       <w:r>
-        <w:rPr>
-          <w:b/>
-          <w:bCs/>
-        </w:rPr>
-        <w:t>[</w:t>
-      </w:r>
-      <w:proofErr w:type="gramEnd"/>
-      <w:r>
-        <w:rPr>
-          <w:b/>
-          <w:bCs/>
-        </w:rPr>
-        <w:t>2]</w:t>
-      </w:r>
-      <w:r>
-        <w:t>, a local REST API plugin that exposes the user’s Anki data (notes, fields, and media files</w:t>
-      </w:r>
-      <w:r>
-        <w:t xml:space="preserve"> including audio</w:t>
-      </w:r>
-      <w:r>
-        <w:t>) through HTTP requests.</w:t>
-      </w:r>
-      <w:r>
-        <w:t xml:space="preserve"> This retrieves the card info from a premade flashcard deck </w:t>
-      </w:r>
-      <w:r>
-        <w:rPr>
-          <w:i/>
-          <w:iCs/>
-        </w:rPr>
-        <w:t>“</w:t>
+        <w:t xml:space="preserve"> to Wav using </w:t>
       </w:r>
       <w:proofErr w:type="spellStart"/>
       <w:r>
-        <w:rPr>
-          <w:b/>
-          <w:bCs/>
-          <w:i/>
-          <w:iCs/>
-        </w:rPr>
-        <w:t>Kaishi</w:t>
+        <w:t>FFmpeg</w:t>
       </w:r>
       <w:proofErr w:type="spellEnd"/>
       <w:r>
-        <w:rPr>
-          <w:b/>
-          <w:bCs/>
-          <w:i/>
-          <w:iCs/>
-        </w:rPr>
-        <w:t xml:space="preserve"> 1.5k - Basic Japanese </w:t>
-      </w:r>
-      <w:proofErr w:type="gramStart"/>
-      <w:r>
-        <w:rPr>
-          <w:b/>
-          <w:bCs/>
-          <w:i/>
-          <w:iCs/>
-        </w:rPr>
-        <w:t>Vocabulary</w:t>
-      </w:r>
-      <w:r>
-        <w:rPr>
-          <w:b/>
-          <w:bCs/>
-          <w:i/>
-          <w:iCs/>
-        </w:rPr>
-        <w:t>[3]</w:t>
-      </w:r>
-      <w:r>
-        <w:rPr>
-          <w:b/>
-          <w:bCs/>
-          <w:i/>
-          <w:iCs/>
-        </w:rPr>
-        <w:t>“</w:t>
-      </w:r>
-      <w:proofErr w:type="gramEnd"/>
-    </w:p>
-    <w:p/>
-    <w:p>
-      <w:r>
-        <w:lastRenderedPageBreak/>
-        <w:t xml:space="preserve">Since Flutter Web and mobile apps </w:t>
-      </w:r>
-      <w:r>
-        <w:rPr>
-          <w:b/>
-          <w:bCs/>
-        </w:rPr>
-        <w:t xml:space="preserve">cannot directly </w:t>
-      </w:r>
-      <w:proofErr w:type="gramStart"/>
-      <w:r>
-        <w:rPr>
-          <w:b/>
-          <w:bCs/>
-        </w:rPr>
-        <w:t>read .</w:t>
-      </w:r>
-      <w:proofErr w:type="spellStart"/>
-      <w:r>
-        <w:rPr>
-          <w:b/>
-          <w:bCs/>
-        </w:rPr>
-        <w:t>apkg</w:t>
-      </w:r>
-      <w:proofErr w:type="spellEnd"/>
-      <w:proofErr w:type="gramEnd"/>
-      <w:r>
-        <w:rPr>
-          <w:b/>
-          <w:bCs/>
-        </w:rPr>
-        <w:t xml:space="preserve"> deck files</w:t>
-      </w:r>
-      <w:r>
-        <w:t xml:space="preserve"> (due to SQLite parsing limitations and browser sandboxes), </w:t>
-      </w:r>
-      <w:r>
-        <w:t xml:space="preserve">I used </w:t>
-      </w:r>
-      <w:r>
-        <w:t xml:space="preserve">preprocessing script in Dart to extract all relevant flashcard information </w:t>
-      </w:r>
-      <w:r>
-        <w:rPr>
-          <w:b/>
-          <w:bCs/>
-        </w:rPr>
-        <w:t>before packaging the app</w:t>
-      </w:r>
-      <w:r>
-        <w:t>, later this will be reworked so the deck is uploaded to the firebase database.</w:t>
-      </w:r>
-    </w:p>
-    <w:p/>
-    <w:p>
-      <w:pPr>
-        <w:pStyle w:val="Heading1"/>
-      </w:pPr>
-      <w:bookmarkStart w:id="5" w:name="_Toc215499732"/>
-      <w:r>
-        <w:t>USER INTERFACE ARCHITECTURE</w:t>
-      </w:r>
-      <w:bookmarkEnd w:id="5"/>
-    </w:p>
-    <w:p/>
-    <w:p>
-      <w:pPr>
-        <w:pStyle w:val="Heading2"/>
-      </w:pPr>
-      <w:r>
-        <w:t>Widget Hierarchy</w:t>
-      </w:r>
-    </w:p>
-    <w:p>
-      <w:r>
-        <w:t>The UI is decomposed into modular, testable widgets, each following the Single Responsibility Principle:</w:t>
-      </w:r>
-    </w:p>
-    <w:p>
-      <w:pPr>
-        <w:numPr>
-          <w:ilvl w:val="0"/>
-          <w:numId w:val="14"/>
-        </w:numPr>
-      </w:pPr>
-      <w:proofErr w:type="spellStart"/>
-      <w:r>
-        <w:rPr>
-          <w:b/>
-          <w:bCs/>
-        </w:rPr>
-        <w:t>WelcomeScreen</w:t>
-      </w:r>
-      <w:proofErr w:type="spellEnd"/>
-      <w:r>
-        <w:br/>
-        <w:t>Determines navigation flow based on authentication state.</w:t>
-      </w:r>
-    </w:p>
-    <w:p>
-      <w:pPr>
-        <w:numPr>
-          <w:ilvl w:val="0"/>
-          <w:numId w:val="14"/>
-        </w:numPr>
-      </w:pPr>
-      <w:proofErr w:type="spellStart"/>
-      <w:r>
-        <w:rPr>
-          <w:b/>
-          <w:bCs/>
-        </w:rPr>
-        <w:t>LoginScreen</w:t>
-      </w:r>
-      <w:proofErr w:type="spellEnd"/>
-      <w:r>
-        <w:br/>
-        <w:t xml:space="preserve">Implements Google Sign-In using </w:t>
-      </w:r>
-      <w:proofErr w:type="spellStart"/>
-      <w:r>
-        <w:t>FirebaseAuth</w:t>
-      </w:r>
-      <w:proofErr w:type="spellEnd"/>
-      <w:r>
-        <w:t>.</w:t>
-      </w:r>
-    </w:p>
-    <w:p>
-      <w:pPr>
-        <w:numPr>
-          <w:ilvl w:val="0"/>
-          <w:numId w:val="14"/>
-        </w:numPr>
-      </w:pPr>
-      <w:proofErr w:type="spellStart"/>
-      <w:r>
-        <w:rPr>
-          <w:b/>
-          <w:bCs/>
-        </w:rPr>
-        <w:t>HomeScreen</w:t>
-      </w:r>
-      <w:proofErr w:type="spellEnd"/>
-      <w:r>
-        <w:br/>
-        <w:t>Displays flashcards, handles recording, transmits audio to the backend, and renders pitch graphs.</w:t>
-      </w:r>
-    </w:p>
-    <w:p>
-      <w:pPr>
-        <w:numPr>
-          <w:ilvl w:val="0"/>
-          <w:numId w:val="14"/>
-        </w:numPr>
-      </w:pPr>
-      <w:proofErr w:type="spellStart"/>
-      <w:r>
-        <w:rPr>
-          <w:b/>
-          <w:bCs/>
-        </w:rPr>
-        <w:t>WordCard</w:t>
-      </w:r>
-      <w:proofErr w:type="spellEnd"/>
-      <w:r>
-        <w:rPr>
-          <w:b/>
-          <w:bCs/>
-        </w:rPr>
-        <w:t xml:space="preserve"> Widget</w:t>
-      </w:r>
-      <w:r>
-        <w:br/>
-        <w:t>Presents:</w:t>
-      </w:r>
-    </w:p>
-    <w:p>
-      <w:pPr>
-        <w:numPr>
-          <w:ilvl w:val="1"/>
-          <w:numId w:val="14"/>
-        </w:numPr>
-      </w:pPr>
-      <w:r>
-        <w:t>Kanji</w:t>
-      </w:r>
-    </w:p>
-    <w:p>
-      <w:pPr>
-        <w:numPr>
-          <w:ilvl w:val="1"/>
-          <w:numId w:val="14"/>
-        </w:numPr>
-      </w:pPr>
-      <w:r>
-        <w:t>Furigana</w:t>
-      </w:r>
-    </w:p>
-    <w:p>
-      <w:pPr>
-        <w:numPr>
-          <w:ilvl w:val="1"/>
-          <w:numId w:val="14"/>
-        </w:numPr>
-      </w:pPr>
-      <w:r>
-        <w:t>English meaning</w:t>
-      </w:r>
-    </w:p>
-    <w:p>
-      <w:pPr>
-        <w:numPr>
-          <w:ilvl w:val="1"/>
-          <w:numId w:val="14"/>
-        </w:numPr>
-      </w:pPr>
-      <w:r>
-        <w:t>Example sentence</w:t>
-      </w:r>
-    </w:p>
-    <w:p>
-      <w:pPr>
-        <w:numPr>
-          <w:ilvl w:val="1"/>
-          <w:numId w:val="14"/>
-        </w:numPr>
-      </w:pPr>
-      <w:r>
-        <w:t>Native speaker audio button</w:t>
-      </w:r>
-    </w:p>
-    <w:p>
-      <w:r>
-        <w:t>This mirrors standard Japanese learning tools (e.g., Anki), maintaining user familiarity.</w:t>
+        <w:t xml:space="preserve"> , so pitch extraction can take place. </w:t>
       </w:r>
     </w:p>
     <w:p/>
@@ -1956,24 +1556,431 @@
     <w:p/>
     <w:p/>
     <w:p/>
+    <w:p/>
+    <w:p/>
+    <w:p/>
+    <w:p/>
+    <w:p/>
+    <w:p/>
+    <w:p/>
+    <w:p/>
+    <w:p/>
     <w:p>
       <w:pPr>
         <w:pStyle w:val="Heading2"/>
       </w:pPr>
+      <w:bookmarkStart w:id="3" w:name="_Toc215499730"/>
+      <w:r>
+        <w:t>Data Layer (Firebase + Local JSON Assets)</w:t>
+      </w:r>
+      <w:bookmarkEnd w:id="3"/>
+    </w:p>
+    <w:p/>
+    <w:p>
+      <w:r>
+        <w:t>The project integrates two data sources:</w:t>
+      </w:r>
+    </w:p>
+    <w:p>
+      <w:pPr>
+        <w:numPr>
+          <w:ilvl w:val="0"/>
+          <w:numId w:val="13"/>
+        </w:numPr>
+      </w:pPr>
+      <w:r>
+        <w:rPr>
+          <w:b/>
+          <w:bCs/>
+        </w:rPr>
+        <w:t>Firebase Authentication</w:t>
+      </w:r>
+      <w:r>
+        <w:t>: Manages secure user sessions.</w:t>
+      </w:r>
+    </w:p>
+    <w:p>
+      <w:pPr>
+        <w:numPr>
+          <w:ilvl w:val="0"/>
+          <w:numId w:val="13"/>
+        </w:numPr>
+      </w:pPr>
+      <w:r>
+        <w:rPr>
+          <w:b/>
+          <w:bCs/>
+        </w:rPr>
+        <w:t>Local JSON Decks</w:t>
+      </w:r>
+      <w:r>
+        <w:t>: Pre-processed Anki flashcards containing vocabulary, readings, example sentences, and audio assets.</w:t>
+      </w:r>
+    </w:p>
+    <w:p/>
+    <w:p>
+      <w:pPr>
+        <w:pStyle w:val="Heading1"/>
+      </w:pPr>
+      <w:bookmarkStart w:id="4" w:name="_Toc215499731"/>
+      <w:r>
+        <w:t>anki connect api</w:t>
+      </w:r>
+      <w:bookmarkEnd w:id="4"/>
+    </w:p>
+    <w:p/>
+    <w:p>
+      <w:r>
+        <w:t>T</w:t>
+      </w:r>
+      <w:r>
+        <w:t xml:space="preserve">o integrate vocabulary from the </w:t>
+      </w:r>
+      <w:r>
+        <w:t xml:space="preserve">a </w:t>
+      </w:r>
+      <w:r>
+        <w:t xml:space="preserve">deck into </w:t>
+      </w:r>
+      <w:r>
+        <w:t>flutter</w:t>
+      </w:r>
+      <w:r>
+        <w:t xml:space="preserve">, the project uses </w:t>
+      </w:r>
+      <w:proofErr w:type="spellStart"/>
+      <w:r>
+        <w:rPr>
+          <w:b/>
+          <w:bCs/>
+        </w:rPr>
+        <w:t>AnkiConnect</w:t>
+      </w:r>
+      <w:proofErr w:type="spellEnd"/>
+      <w:r>
+        <w:rPr>
+          <w:b/>
+          <w:bCs/>
+        </w:rPr>
+        <w:t>[2]</w:t>
+      </w:r>
+      <w:r>
+        <w:t>, a local REST API plugin that exposes the user’s Anki data (notes, fields, and media files</w:t>
+      </w:r>
+      <w:r>
+        <w:t xml:space="preserve"> including audio</w:t>
+      </w:r>
+      <w:r>
+        <w:t>) through HTTP requests.</w:t>
+      </w:r>
+      <w:r>
+        <w:t xml:space="preserve"> This retrieves the card info from a premade flashcard deck </w:t>
+      </w:r>
+      <w:r>
+        <w:rPr>
+          <w:i/>
+          <w:iCs/>
+        </w:rPr>
+        <w:t>“</w:t>
+      </w:r>
+      <w:proofErr w:type="spellStart"/>
+      <w:r>
+        <w:rPr>
+          <w:b/>
+          <w:bCs/>
+          <w:i/>
+          <w:iCs/>
+        </w:rPr>
+        <w:t>Kaishi</w:t>
+      </w:r>
+      <w:proofErr w:type="spellEnd"/>
+      <w:r>
+        <w:rPr>
+          <w:b/>
+          <w:bCs/>
+          <w:i/>
+          <w:iCs/>
+        </w:rPr>
+        <w:t xml:space="preserve"> 1.5k - Basic Japanese Vocabulary</w:t>
+      </w:r>
+      <w:r>
+        <w:rPr>
+          <w:b/>
+          <w:bCs/>
+          <w:i/>
+          <w:iCs/>
+        </w:rPr>
+        <w:t>[3]</w:t>
+      </w:r>
+      <w:r>
+        <w:rPr>
+          <w:b/>
+          <w:bCs/>
+          <w:i/>
+          <w:iCs/>
+        </w:rPr>
+        <w:t>“</w:t>
+      </w:r>
+    </w:p>
+    <w:p/>
+    <w:p>
+      <w:r>
+        <w:t xml:space="preserve">Since Flutter Web and mobile apps </w:t>
+      </w:r>
+      <w:r>
+        <w:rPr>
+          <w:b/>
+          <w:bCs/>
+        </w:rPr>
+        <w:t>cannot directly read .</w:t>
+      </w:r>
+      <w:proofErr w:type="spellStart"/>
+      <w:r>
+        <w:rPr>
+          <w:b/>
+          <w:bCs/>
+        </w:rPr>
+        <w:t>apkg</w:t>
+      </w:r>
+      <w:proofErr w:type="spellEnd"/>
+      <w:r>
+        <w:rPr>
+          <w:b/>
+          <w:bCs/>
+        </w:rPr>
+        <w:t xml:space="preserve"> deck files</w:t>
+      </w:r>
+      <w:r>
+        <w:t xml:space="preserve"> (due to SQLite parsing limitations and browser sandboxes), </w:t>
+      </w:r>
+      <w:r>
+        <w:t xml:space="preserve">I used </w:t>
+      </w:r>
+      <w:r>
+        <w:t xml:space="preserve">preprocessing script in Dart to extract all relevant flashcard information </w:t>
+      </w:r>
+      <w:r>
+        <w:rPr>
+          <w:b/>
+          <w:bCs/>
+        </w:rPr>
+        <w:t>before packaging the app</w:t>
+      </w:r>
+      <w:r>
+        <w:t>, later this will be reworked so the deck is uploaded to the firebase database.</w:t>
+      </w:r>
+    </w:p>
+    <w:p/>
+    <w:p>
+      <w:pPr>
+        <w:pStyle w:val="Heading1"/>
+      </w:pPr>
+      <w:bookmarkStart w:id="5" w:name="_Toc215499732"/>
+      <w:r>
+        <w:t>USER INTERFACE ARCHITECTURE</w:t>
+      </w:r>
+      <w:bookmarkEnd w:id="5"/>
+    </w:p>
+    <w:p/>
+    <w:p>
+      <w:pPr>
+        <w:pStyle w:val="Heading2"/>
+      </w:pPr>
+      <w:r>
+        <w:t>Widget Hierarchy</w:t>
+      </w:r>
+    </w:p>
+    <w:p>
+      <w:r>
+        <w:t>The UI is decomposed into modular, testable widgets, each following the Single Responsibility Principle:</w:t>
+      </w:r>
+    </w:p>
+    <w:p>
+      <w:pPr>
+        <w:numPr>
+          <w:ilvl w:val="0"/>
+          <w:numId w:val="14"/>
+        </w:numPr>
+      </w:pPr>
+      <w:proofErr w:type="spellStart"/>
+      <w:r>
+        <w:rPr>
+          <w:b/>
+          <w:bCs/>
+        </w:rPr>
+        <w:lastRenderedPageBreak/>
+        <w:t>WelcomeScreen</w:t>
+      </w:r>
+      <w:proofErr w:type="spellEnd"/>
+      <w:r>
+        <w:br/>
+        <w:t>Determines navigation flow based on authentication state.</w:t>
+      </w:r>
+    </w:p>
+    <w:p>
+      <w:pPr>
+        <w:numPr>
+          <w:ilvl w:val="0"/>
+          <w:numId w:val="14"/>
+        </w:numPr>
+      </w:pPr>
+      <w:proofErr w:type="spellStart"/>
+      <w:r>
+        <w:rPr>
+          <w:b/>
+          <w:bCs/>
+        </w:rPr>
+        <w:t>LoginScreen</w:t>
+      </w:r>
+      <w:proofErr w:type="spellEnd"/>
+      <w:r>
+        <w:br/>
+        <w:t xml:space="preserve">Implements Google Sign-In using </w:t>
+      </w:r>
+      <w:proofErr w:type="spellStart"/>
+      <w:r>
+        <w:t>FirebaseAuth</w:t>
+      </w:r>
+      <w:proofErr w:type="spellEnd"/>
+      <w:r>
+        <w:t>.</w:t>
+      </w:r>
+    </w:p>
+    <w:p>
+      <w:pPr>
+        <w:numPr>
+          <w:ilvl w:val="0"/>
+          <w:numId w:val="14"/>
+        </w:numPr>
+      </w:pPr>
+      <w:proofErr w:type="spellStart"/>
+      <w:r>
+        <w:rPr>
+          <w:b/>
+          <w:bCs/>
+        </w:rPr>
+        <w:t>HomeScreen</w:t>
+      </w:r>
+      <w:proofErr w:type="spellEnd"/>
+      <w:r>
+        <w:br/>
+        <w:t>Displays flashcards, handles recording, transmits audio to the backend, and renders pitch graphs.</w:t>
+      </w:r>
+    </w:p>
+    <w:p>
+      <w:pPr>
+        <w:numPr>
+          <w:ilvl w:val="0"/>
+          <w:numId w:val="14"/>
+        </w:numPr>
+      </w:pPr>
+      <w:proofErr w:type="spellStart"/>
+      <w:r>
+        <w:rPr>
+          <w:b/>
+          <w:bCs/>
+        </w:rPr>
+        <w:t>WordCard</w:t>
+      </w:r>
+      <w:proofErr w:type="spellEnd"/>
+      <w:r>
+        <w:rPr>
+          <w:b/>
+          <w:bCs/>
+        </w:rPr>
+        <w:t xml:space="preserve"> Widget</w:t>
+      </w:r>
+      <w:r>
+        <w:br/>
+        <w:t>Presents:</w:t>
+      </w:r>
+    </w:p>
+    <w:p>
+      <w:pPr>
+        <w:numPr>
+          <w:ilvl w:val="1"/>
+          <w:numId w:val="14"/>
+        </w:numPr>
+      </w:pPr>
+      <w:r>
+        <w:t>Kanji</w:t>
+      </w:r>
+    </w:p>
+    <w:p>
+      <w:pPr>
+        <w:numPr>
+          <w:ilvl w:val="1"/>
+          <w:numId w:val="14"/>
+        </w:numPr>
+      </w:pPr>
+      <w:r>
+        <w:t>Furigana</w:t>
+      </w:r>
+    </w:p>
+    <w:p>
+      <w:pPr>
+        <w:numPr>
+          <w:ilvl w:val="1"/>
+          <w:numId w:val="14"/>
+        </w:numPr>
+      </w:pPr>
+      <w:r>
+        <w:t>English meaning</w:t>
+      </w:r>
+    </w:p>
+    <w:p>
+      <w:pPr>
+        <w:numPr>
+          <w:ilvl w:val="1"/>
+          <w:numId w:val="14"/>
+        </w:numPr>
+      </w:pPr>
+      <w:r>
+        <w:t>Example sentence</w:t>
+      </w:r>
+    </w:p>
+    <w:p>
+      <w:pPr>
+        <w:numPr>
+          <w:ilvl w:val="1"/>
+          <w:numId w:val="14"/>
+        </w:numPr>
+      </w:pPr>
+      <w:r>
+        <w:t>Native speaker audio button</w:t>
+      </w:r>
+    </w:p>
+    <w:p>
+      <w:r>
+        <w:t>This mirrors standard Japanese learning tools (e.g., Anki), maintaining user familiarity.</w:t>
+      </w:r>
+    </w:p>
+    <w:p/>
+    <w:p/>
+    <w:p/>
+    <w:p/>
+    <w:p/>
+    <w:p>
+      <w:pPr>
+        <w:pStyle w:val="Heading2"/>
+      </w:pPr>
       <w:bookmarkStart w:id="6" w:name="_Toc215499733"/>
       <w:r>
+        <w:t>UI screenshots</w:t>
+      </w:r>
+      <w:bookmarkEnd w:id="6"/>
+    </w:p>
+    <w:p>
+      <w:r>
+        <w:t>App flashcard format as presented to the user before audio has been uploaded</w:t>
+      </w:r>
+    </w:p>
+    <w:p>
+      <w:r>
+        <w:rPr>
+          <w:noProof/>
+        </w:rPr>
         <w:lastRenderedPageBreak/>
-        <w:t>UI screenshots</w:t>
-      </w:r>
-      <w:bookmarkEnd w:id="6"/>
-    </w:p>
-    <w:p>
-      <w:r>
-        <w:t>App flashcard format as presented to the user before audio has been uploaded</w:t>
-      </w:r>
-    </w:p>
-    <w:p>
-      <w:r>
         <w:drawing>
           <wp:inline distT="0" distB="0" distL="0" distR="0" wp14:anchorId="100B6EF6" wp14:editId="1E8EB938">
             <wp:extent cx="2276943" cy="3170969"/>
@@ -2013,14 +2020,14 @@
     </w:p>
     <w:p>
       <w:r>
-        <w:t xml:space="preserve">App flashcard </w:t>
-      </w:r>
-      <w:r>
-        <w:t>after using has uploaded audio from a file and pressed analyse pitch.</w:t>
-      </w:r>
-    </w:p>
-    <w:p>
-      <w:r>
+        <w:t>App flashcard after using has uploaded audio from a file and pressed analyse pitch.</w:t>
+      </w:r>
+    </w:p>
+    <w:p>
+      <w:r>
+        <w:rPr>
+          <w:noProof/>
+        </w:rPr>
         <w:drawing>
           <wp:inline distT="0" distB="0" distL="0" distR="0" wp14:anchorId="40FCFD60" wp14:editId="24B2D003">
             <wp:extent cx="2371690" cy="3132386"/>
@@ -2067,7 +2074,6 @@
       </w:pPr>
       <w:bookmarkStart w:id="7" w:name="_Toc215499734"/>
       <w:r>
-        <w:lastRenderedPageBreak/>
         <w:t>References</w:t>
       </w:r>
       <w:bookmarkEnd w:id="7"/>
@@ -2097,7 +2103,6 @@
         </w:rPr>
         <w:t xml:space="preserve">[1] </w:t>
       </w:r>
-      <w:proofErr w:type="gramStart"/>
       <w:r>
         <w:rPr>
           <w:b/>
@@ -2111,7 +2116,6 @@
       <w:r>
         <w:t>https://render.com/</w:t>
       </w:r>
-      <w:proofErr w:type="gramEnd"/>
       <w:r>
         <w:t xml:space="preserve"> </w:t>
       </w:r>
@@ -2313,6 +2317,119 @@
 <file path=word/numbering.xml><?xml version="1.0" encoding="utf-8"?>
 <w:numbering xmlns:wpc="http://schemas.microsoft.com/office/word/2010/wordprocessingCanvas" xmlns:cx="http://schemas.microsoft.com/office/drawing/2014/chartex" xmlns:cx1="http://schemas.microsoft.com/office/drawing/2015/9/8/chartex" xmlns:cx2="http://schemas.microsoft.com/office/drawing/2015/10/21/chartex" xmlns:cx3="http://schemas.microsoft.com/office/drawing/2016/5/9/chartex" xmlns:cx4="http://schemas.microsoft.com/office/drawing/2016/5/10/chartex" xmlns:cx5="http://schemas.microsoft.com/office/drawing/2016/5/11/chartex" xmlns:cx6="http://schemas.microsoft.com/office/drawing/2016/5/12/chartex" xmlns:cx7="http://schemas.microsoft.com/office/drawing/2016/5/13/chartex" xmlns:cx8="http://schemas.microsoft.com/office/drawing/2016/5/14/chartex" xmlns:mc="http://schemas.openxmlformats.org/markup-compatibility/2006" xmlns:aink="http://schemas.microsoft.com/office/drawing/2016/ink" xmlns:am3d="http://schemas.microsoft.com/office/drawing/2017/model3d" xmlns:o="urn:schemas-microsoft-com:office:office" xmlns:oel="http://schemas.microsoft.com/office/2019/extlst" xmlns:r="http://schemas.openxmlformats.org/officeDocument/2006/relationships" xmlns:m="http://schemas.openxmlformats.org/officeDocument/2006/math" xmlns:v="urn:schemas-microsoft-com:vml" xmlns:wp14="http://schemas.microsoft.com/office/word/2010/wordprocessingDrawing" xmlns:wp="http://schemas.openxmlformats.org/drawingml/2006/wordprocessingDrawing" xmlns:w10="urn:schemas-microsoft-com:office:word" xmlns:w="http://schemas.openxmlformats.org/wordprocessingml/2006/main" xmlns:w14="http://schemas.microsoft.com/office/word/2010/wordml" xmlns:w15="http://schemas.microsoft.com/office/word/2012/wordml" xmlns:w16cex="http://schemas.microsoft.com/office/word/2018/wordml/cex" xmlns:w16cid="http://schemas.microsoft.com/office/word/2016/wordml/cid" xmlns:w16="http://schemas.microsoft.com/office/word/2018/wordml" xmlns:w16du="http://schemas.microsoft.com/office/word/2023/wordml/word16du" xmlns:w16sdtdh="http://schemas.microsoft.com/office/word/2020/wordml/sdtdatahash" xmlns:w16sdtfl="http://schemas.microsoft.com/office/word/2024/wordml/sdtformatlock" xmlns:w16se="http://schemas.microsoft.com/office/word/2015/wordml/symex" xmlns:wpg="http://schemas.microsoft.com/office/word/2010/wordprocessingGroup" xmlns:wpi="http://schemas.microsoft.com/office/word/2010/wordprocessingInk" xmlns:wne="http://schemas.microsoft.com/office/word/2006/wordml" xmlns:wps="http://schemas.microsoft.com/office/word/2010/wordprocessingShape" mc:Ignorable="w14 w15 w16se w16cid w16 w16cex w16sdtdh w16sdtfl w16du wp14">
   <w:abstractNum w:abstractNumId="0" w15:restartNumberingAfterBreak="0">
+    <w:nsid w:val="01537B64"/>
+    <w:multiLevelType w:val="hybridMultilevel"/>
+    <w:tmpl w:val="F678FAC4"/>
+    <w:lvl w:ilvl="0" w:tplc="18090001">
+      <w:start w:val="1"/>
+      <w:numFmt w:val="bullet"/>
+      <w:lvlText w:val=""/>
+      <w:lvlJc w:val="left"/>
+      <w:pPr>
+        <w:ind w:left="720" w:hanging="360"/>
+      </w:pPr>
+      <w:rPr>
+        <w:rFonts w:ascii="Symbol" w:hAnsi="Symbol" w:hint="default"/>
+      </w:rPr>
+    </w:lvl>
+    <w:lvl w:ilvl="1" w:tplc="18090003" w:tentative="1">
+      <w:start w:val="1"/>
+      <w:numFmt w:val="bullet"/>
+      <w:lvlText w:val="o"/>
+      <w:lvlJc w:val="left"/>
+      <w:pPr>
+        <w:ind w:left="1440" w:hanging="360"/>
+      </w:pPr>
+      <w:rPr>
+        <w:rFonts w:ascii="Courier New" w:hAnsi="Courier New" w:cs="Courier New" w:hint="default"/>
+      </w:rPr>
+    </w:lvl>
+    <w:lvl w:ilvl="2" w:tplc="18090005" w:tentative="1">
+      <w:start w:val="1"/>
+      <w:numFmt w:val="bullet"/>
+      <w:lvlText w:val=""/>
+      <w:lvlJc w:val="left"/>
+      <w:pPr>
+        <w:ind w:left="2160" w:hanging="360"/>
+      </w:pPr>
+      <w:rPr>
+        <w:rFonts w:ascii="Wingdings" w:hAnsi="Wingdings" w:hint="default"/>
+      </w:rPr>
+    </w:lvl>
+    <w:lvl w:ilvl="3" w:tplc="18090001" w:tentative="1">
+      <w:start w:val="1"/>
+      <w:numFmt w:val="bullet"/>
+      <w:lvlText w:val=""/>
+      <w:lvlJc w:val="left"/>
+      <w:pPr>
+        <w:ind w:left="2880" w:hanging="360"/>
+      </w:pPr>
+      <w:rPr>
+        <w:rFonts w:ascii="Symbol" w:hAnsi="Symbol" w:hint="default"/>
+      </w:rPr>
+    </w:lvl>
+    <w:lvl w:ilvl="4" w:tplc="18090003" w:tentative="1">
+      <w:start w:val="1"/>
+      <w:numFmt w:val="bullet"/>
+      <w:lvlText w:val="o"/>
+      <w:lvlJc w:val="left"/>
+      <w:pPr>
+        <w:ind w:left="3600" w:hanging="360"/>
+      </w:pPr>
+      <w:rPr>
+        <w:rFonts w:ascii="Courier New" w:hAnsi="Courier New" w:cs="Courier New" w:hint="default"/>
+      </w:rPr>
+    </w:lvl>
+    <w:lvl w:ilvl="5" w:tplc="18090005" w:tentative="1">
+      <w:start w:val="1"/>
+      <w:numFmt w:val="bullet"/>
+      <w:lvlText w:val=""/>
+      <w:lvlJc w:val="left"/>
+      <w:pPr>
+        <w:ind w:left="4320" w:hanging="360"/>
+      </w:pPr>
+      <w:rPr>
+        <w:rFonts w:ascii="Wingdings" w:hAnsi="Wingdings" w:hint="default"/>
+      </w:rPr>
+    </w:lvl>
+    <w:lvl w:ilvl="6" w:tplc="18090001" w:tentative="1">
+      <w:start w:val="1"/>
+      <w:numFmt w:val="bullet"/>
+      <w:lvlText w:val=""/>
+      <w:lvlJc w:val="left"/>
+      <w:pPr>
+        <w:ind w:left="5040" w:hanging="360"/>
+      </w:pPr>
+      <w:rPr>
+        <w:rFonts w:ascii="Symbol" w:hAnsi="Symbol" w:hint="default"/>
+      </w:rPr>
+    </w:lvl>
+    <w:lvl w:ilvl="7" w:tplc="18090003" w:tentative="1">
+      <w:start w:val="1"/>
+      <w:numFmt w:val="bullet"/>
+      <w:lvlText w:val="o"/>
+      <w:lvlJc w:val="left"/>
+      <w:pPr>
+        <w:ind w:left="5760" w:hanging="360"/>
+      </w:pPr>
+      <w:rPr>
+        <w:rFonts w:ascii="Courier New" w:hAnsi="Courier New" w:cs="Courier New" w:hint="default"/>
+      </w:rPr>
+    </w:lvl>
+    <w:lvl w:ilvl="8" w:tplc="18090005" w:tentative="1">
+      <w:start w:val="1"/>
+      <w:numFmt w:val="bullet"/>
+      <w:lvlText w:val=""/>
+      <w:lvlJc w:val="left"/>
+      <w:pPr>
+        <w:ind w:left="6480" w:hanging="360"/>
+      </w:pPr>
+      <w:rPr>
+        <w:rFonts w:ascii="Wingdings" w:hAnsi="Wingdings" w:hint="default"/>
+      </w:rPr>
+    </w:lvl>
+  </w:abstractNum>
+  <w:abstractNum w:abstractNumId="1" w15:restartNumberingAfterBreak="0">
     <w:nsid w:val="06DA7D38"/>
     <w:multiLevelType w:val="hybridMultilevel"/>
     <w:tmpl w:val="14FA1CE2"/>
@@ -2401,7 +2518,7 @@
       </w:pPr>
     </w:lvl>
   </w:abstractNum>
-  <w:abstractNum w:abstractNumId="1" w15:restartNumberingAfterBreak="0">
+  <w:abstractNum w:abstractNumId="2" w15:restartNumberingAfterBreak="0">
     <w:nsid w:val="0AED492F"/>
     <w:multiLevelType w:val="multilevel"/>
     <w:tmpl w:val="B72E03E6"/>
@@ -2550,7 +2667,7 @@
       </w:rPr>
     </w:lvl>
   </w:abstractNum>
-  <w:abstractNum w:abstractNumId="2" w15:restartNumberingAfterBreak="0">
+  <w:abstractNum w:abstractNumId="3" w15:restartNumberingAfterBreak="0">
     <w:nsid w:val="1B7E71BA"/>
     <w:multiLevelType w:val="hybridMultilevel"/>
     <w:tmpl w:val="8F122AA2"/>
@@ -2663,7 +2780,7 @@
       </w:rPr>
     </w:lvl>
   </w:abstractNum>
-  <w:abstractNum w:abstractNumId="3" w15:restartNumberingAfterBreak="0">
+  <w:abstractNum w:abstractNumId="4" w15:restartNumberingAfterBreak="0">
     <w:nsid w:val="1D08725B"/>
     <w:multiLevelType w:val="multilevel"/>
     <w:tmpl w:val="A4CEDEEE"/>
@@ -2812,7 +2929,7 @@
       </w:rPr>
     </w:lvl>
   </w:abstractNum>
-  <w:abstractNum w:abstractNumId="4" w15:restartNumberingAfterBreak="0">
+  <w:abstractNum w:abstractNumId="5" w15:restartNumberingAfterBreak="0">
     <w:nsid w:val="1F6C364C"/>
     <w:multiLevelType w:val="multilevel"/>
     <w:tmpl w:val="98AEC3E2"/>
@@ -2961,7 +3078,93 @@
       </w:rPr>
     </w:lvl>
   </w:abstractNum>
-  <w:abstractNum w:abstractNumId="5" w15:restartNumberingAfterBreak="0">
+  <w:abstractNum w:abstractNumId="6" w15:restartNumberingAfterBreak="0">
+    <w:nsid w:val="201C0BF8"/>
+    <w:multiLevelType w:val="hybridMultilevel"/>
+    <w:tmpl w:val="98EE5FDA"/>
+    <w:lvl w:ilvl="0" w:tplc="1809000F">
+      <w:start w:val="1"/>
+      <w:numFmt w:val="decimal"/>
+      <w:lvlText w:val="%1."/>
+      <w:lvlJc w:val="left"/>
+      <w:pPr>
+        <w:ind w:left="720" w:hanging="360"/>
+      </w:pPr>
+    </w:lvl>
+    <w:lvl w:ilvl="1" w:tplc="18090019" w:tentative="1">
+      <w:start w:val="1"/>
+      <w:numFmt w:val="lowerLetter"/>
+      <w:lvlText w:val="%2."/>
+      <w:lvlJc w:val="left"/>
+      <w:pPr>
+        <w:ind w:left="1440" w:hanging="360"/>
+      </w:pPr>
+    </w:lvl>
+    <w:lvl w:ilvl="2" w:tplc="1809001B" w:tentative="1">
+      <w:start w:val="1"/>
+      <w:numFmt w:val="lowerRoman"/>
+      <w:lvlText w:val="%3."/>
+      <w:lvlJc w:val="right"/>
+      <w:pPr>
+        <w:ind w:left="2160" w:hanging="180"/>
+      </w:pPr>
+    </w:lvl>
+    <w:lvl w:ilvl="3" w:tplc="1809000F" w:tentative="1">
+      <w:start w:val="1"/>
+      <w:numFmt w:val="decimal"/>
+      <w:lvlText w:val="%4."/>
+      <w:lvlJc w:val="left"/>
+      <w:pPr>
+        <w:ind w:left="2880" w:hanging="360"/>
+      </w:pPr>
+    </w:lvl>
+    <w:lvl w:ilvl="4" w:tplc="18090019" w:tentative="1">
+      <w:start w:val="1"/>
+      <w:numFmt w:val="lowerLetter"/>
+      <w:lvlText w:val="%5."/>
+      <w:lvlJc w:val="left"/>
+      <w:pPr>
+        <w:ind w:left="3600" w:hanging="360"/>
+      </w:pPr>
+    </w:lvl>
+    <w:lvl w:ilvl="5" w:tplc="1809001B" w:tentative="1">
+      <w:start w:val="1"/>
+      <w:numFmt w:val="lowerRoman"/>
+      <w:lvlText w:val="%6."/>
+      <w:lvlJc w:val="right"/>
+      <w:pPr>
+        <w:ind w:left="4320" w:hanging="180"/>
+      </w:pPr>
+    </w:lvl>
+    <w:lvl w:ilvl="6" w:tplc="1809000F" w:tentative="1">
+      <w:start w:val="1"/>
+      <w:numFmt w:val="decimal"/>
+      <w:lvlText w:val="%7."/>
+      <w:lvlJc w:val="left"/>
+      <w:pPr>
+        <w:ind w:left="5040" w:hanging="360"/>
+      </w:pPr>
+    </w:lvl>
+    <w:lvl w:ilvl="7" w:tplc="18090019" w:tentative="1">
+      <w:start w:val="1"/>
+      <w:numFmt w:val="lowerLetter"/>
+      <w:lvlText w:val="%8."/>
+      <w:lvlJc w:val="left"/>
+      <w:pPr>
+        <w:ind w:left="5760" w:hanging="360"/>
+      </w:pPr>
+    </w:lvl>
+    <w:lvl w:ilvl="8" w:tplc="1809001B" w:tentative="1">
+      <w:start w:val="1"/>
+      <w:numFmt w:val="lowerRoman"/>
+      <w:lvlText w:val="%9."/>
+      <w:lvlJc w:val="right"/>
+      <w:pPr>
+        <w:ind w:left="6480" w:hanging="180"/>
+      </w:pPr>
+    </w:lvl>
+  </w:abstractNum>
+  <w:abstractNum w:abstractNumId="7" w15:restartNumberingAfterBreak="0">
     <w:nsid w:val="29E32C8E"/>
     <w:multiLevelType w:val="hybridMultilevel"/>
     <w:tmpl w:val="13A4DE2A"/>
@@ -3074,7 +3277,7 @@
       </w:rPr>
     </w:lvl>
   </w:abstractNum>
-  <w:abstractNum w:abstractNumId="6" w15:restartNumberingAfterBreak="0">
+  <w:abstractNum w:abstractNumId="8" w15:restartNumberingAfterBreak="0">
     <w:nsid w:val="30EC7B69"/>
     <w:multiLevelType w:val="multilevel"/>
     <w:tmpl w:val="584CAD4C"/>
@@ -3223,7 +3426,7 @@
       </w:rPr>
     </w:lvl>
   </w:abstractNum>
-  <w:abstractNum w:abstractNumId="7" w15:restartNumberingAfterBreak="0">
+  <w:abstractNum w:abstractNumId="9" w15:restartNumberingAfterBreak="0">
     <w:nsid w:val="314010CF"/>
     <w:multiLevelType w:val="hybridMultilevel"/>
     <w:tmpl w:val="FE0A71AA"/>
@@ -3336,7 +3539,7 @@
       </w:rPr>
     </w:lvl>
   </w:abstractNum>
-  <w:abstractNum w:abstractNumId="8" w15:restartNumberingAfterBreak="0">
+  <w:abstractNum w:abstractNumId="10" w15:restartNumberingAfterBreak="0">
     <w:nsid w:val="39F64371"/>
     <w:multiLevelType w:val="hybridMultilevel"/>
     <w:tmpl w:val="29DC2F5E"/>
@@ -3449,7 +3652,7 @@
       </w:rPr>
     </w:lvl>
   </w:abstractNum>
-  <w:abstractNum w:abstractNumId="9" w15:restartNumberingAfterBreak="0">
+  <w:abstractNum w:abstractNumId="11" w15:restartNumberingAfterBreak="0">
     <w:nsid w:val="48FD54AB"/>
     <w:multiLevelType w:val="multilevel"/>
     <w:tmpl w:val="B5F06A8C"/>
@@ -3598,7 +3801,7 @@
       </w:rPr>
     </w:lvl>
   </w:abstractNum>
-  <w:abstractNum w:abstractNumId="10" w15:restartNumberingAfterBreak="0">
+  <w:abstractNum w:abstractNumId="12" w15:restartNumberingAfterBreak="0">
     <w:nsid w:val="4ED75CC0"/>
     <w:multiLevelType w:val="multilevel"/>
     <w:tmpl w:val="EE3C3122"/>
@@ -3747,7 +3950,7 @@
       </w:rPr>
     </w:lvl>
   </w:abstractNum>
-  <w:abstractNum w:abstractNumId="11" w15:restartNumberingAfterBreak="0">
+  <w:abstractNum w:abstractNumId="13" w15:restartNumberingAfterBreak="0">
     <w:nsid w:val="5A257B80"/>
     <w:multiLevelType w:val="multilevel"/>
     <w:tmpl w:val="49965C20"/>
@@ -3896,7 +4099,7 @@
       </w:rPr>
     </w:lvl>
   </w:abstractNum>
-  <w:abstractNum w:abstractNumId="12" w15:restartNumberingAfterBreak="0">
+  <w:abstractNum w:abstractNumId="14" w15:restartNumberingAfterBreak="0">
     <w:nsid w:val="647413AF"/>
     <w:multiLevelType w:val="multilevel"/>
     <w:tmpl w:val="A038EE24"/>
@@ -4045,7 +4248,7 @@
       </w:rPr>
     </w:lvl>
   </w:abstractNum>
-  <w:abstractNum w:abstractNumId="13" w15:restartNumberingAfterBreak="0">
+  <w:abstractNum w:abstractNumId="15" w15:restartNumberingAfterBreak="0">
     <w:nsid w:val="72502B79"/>
     <w:multiLevelType w:val="multilevel"/>
     <w:tmpl w:val="EAB2456C"/>
@@ -4195,46 +4398,52 @@
     </w:lvl>
   </w:abstractNum>
   <w:num w:numId="1" w16cid:durableId="1963538749">
+    <w:abstractNumId w:val="4"/>
+  </w:num>
+  <w:num w:numId="2" w16cid:durableId="1274633650">
+    <w:abstractNumId w:val="9"/>
+  </w:num>
+  <w:num w:numId="3" w16cid:durableId="646128456">
+    <w:abstractNumId w:val="7"/>
+  </w:num>
+  <w:num w:numId="4" w16cid:durableId="1193491491">
+    <w:abstractNumId w:val="10"/>
+  </w:num>
+  <w:num w:numId="5" w16cid:durableId="24016940">
+    <w:abstractNumId w:val="1"/>
+  </w:num>
+  <w:num w:numId="6" w16cid:durableId="544636590">
+    <w:abstractNumId w:val="12"/>
+  </w:num>
+  <w:num w:numId="7" w16cid:durableId="1507552805">
+    <w:abstractNumId w:val="8"/>
+  </w:num>
+  <w:num w:numId="8" w16cid:durableId="704906944">
+    <w:abstractNumId w:val="5"/>
+  </w:num>
+  <w:num w:numId="9" w16cid:durableId="766002324">
     <w:abstractNumId w:val="3"/>
   </w:num>
-  <w:num w:numId="2" w16cid:durableId="1274633650">
-    <w:abstractNumId w:val="7"/>
+  <w:num w:numId="10" w16cid:durableId="1562714279">
+    <w:abstractNumId w:val="13"/>
   </w:num>
-  <w:num w:numId="3" w16cid:durableId="646128456">
-    <w:abstractNumId w:val="5"/>
+  <w:num w:numId="11" w16cid:durableId="164589103">
+    <w:abstractNumId w:val="11"/>
   </w:num>
-  <w:num w:numId="4" w16cid:durableId="1193491491">
-    <w:abstractNumId w:val="8"/>
+  <w:num w:numId="12" w16cid:durableId="1000277339">
+    <w:abstractNumId w:val="14"/>
   </w:num>
-  <w:num w:numId="5" w16cid:durableId="24016940">
+  <w:num w:numId="13" w16cid:durableId="1254510640">
+    <w:abstractNumId w:val="15"/>
+  </w:num>
+  <w:num w:numId="14" w16cid:durableId="1786386935">
+    <w:abstractNumId w:val="2"/>
+  </w:num>
+  <w:num w:numId="15" w16cid:durableId="846019917">
     <w:abstractNumId w:val="0"/>
   </w:num>
-  <w:num w:numId="6" w16cid:durableId="544636590">
-    <w:abstractNumId w:val="10"/>
-  </w:num>
-  <w:num w:numId="7" w16cid:durableId="1507552805">
+  <w:num w:numId="16" w16cid:durableId="631253672">
     <w:abstractNumId w:val="6"/>
-  </w:num>
-  <w:num w:numId="8" w16cid:durableId="704906944">
-    <w:abstractNumId w:val="4"/>
-  </w:num>
-  <w:num w:numId="9" w16cid:durableId="766002324">
-    <w:abstractNumId w:val="2"/>
-  </w:num>
-  <w:num w:numId="10" w16cid:durableId="1562714279">
-    <w:abstractNumId w:val="11"/>
-  </w:num>
-  <w:num w:numId="11" w16cid:durableId="164589103">
-    <w:abstractNumId w:val="9"/>
-  </w:num>
-  <w:num w:numId="12" w16cid:durableId="1000277339">
-    <w:abstractNumId w:val="12"/>
-  </w:num>
-  <w:num w:numId="13" w16cid:durableId="1254510640">
-    <w:abstractNumId w:val="13"/>
-  </w:num>
-  <w:num w:numId="14" w16cid:durableId="1786386935">
-    <w:abstractNumId w:val="1"/>
   </w:num>
 </w:numbering>
 </file>
@@ -4635,7 +4844,7 @@
   <w:style w:type="paragraph" w:default="1" w:styleId="Normal">
     <w:name w:val="Normal"/>
     <w:qFormat/>
-    <w:rsid w:val="00B66D2E"/>
+    <w:rsid w:val="007C27AD"/>
     <w:pPr>
       <w:spacing w:before="0" w:after="160" w:line="278" w:lineRule="auto"/>
     </w:pPr>
@@ -4704,7 +4913,6 @@
     <w:next w:val="Normal"/>
     <w:link w:val="Heading3Char"/>
     <w:uiPriority w:val="9"/>
-    <w:semiHidden/>
     <w:unhideWhenUsed/>
     <w:qFormat/>
     <w:rsid w:val="003A0C0F"/>
@@ -4857,8 +5065,9 @@
   <w:style w:type="character" w:default="1" w:styleId="DefaultParagraphFont">
     <w:name w:val="Default Paragraph Font"/>
     <w:uiPriority w:val="1"/>
+    <w:semiHidden/>
     <w:unhideWhenUsed/>
-    <w:rsid w:val="00321863"/>
+    <w:rsid w:val="007C27AD"/>
   </w:style>
   <w:style w:type="table" w:default="1" w:styleId="TableNormal">
     <w:name w:val="Normal Table"/>
@@ -4880,7 +5089,7 @@
     <w:uiPriority w:val="99"/>
     <w:semiHidden/>
     <w:unhideWhenUsed/>
-    <w:rsid w:val="00321863"/>
+    <w:rsid w:val="007C27AD"/>
   </w:style>
   <w:style w:type="character" w:customStyle="1" w:styleId="Heading1Char">
     <w:name w:val="Heading 1 Char"/>
@@ -4914,7 +5123,6 @@
     <w:basedOn w:val="DefaultParagraphFont"/>
     <w:link w:val="Heading3"/>
     <w:uiPriority w:val="9"/>
-    <w:semiHidden/>
     <w:rsid w:val="003A0C0F"/>
     <w:rPr>
       <w:caps/>

</xml_diff>